<commit_message>
Restore original manuscript with targeted empirical revisions
</commit_message>
<xml_diff>
--- a/paper/submission/Highlights.docx
+++ b/paper/submission/Highlights.docx
@@ -20,7 +20,16 @@
           <w:rFonts w:ascii="Times New Roman" w:hAnsi="Times New Roman"/>
           <w:color w:val="000000"/>
         </w:rPr>
-        <w:t>Climate misinformation and quoted liquidity in energy equities</w:t>
+        <w:t>The Information Costs of Climate Misinformation</w:t>
+      </w:r>
+    </w:p>
+    <w:p>
+      <w:r>
+        <w:rPr>
+          <w:rFonts w:ascii="Times New Roman" w:hAnsi="Times New Roman"/>
+          <w:color w:val="000000"/>
+        </w:rPr>
+        <w:t>Evidence from Global Financial Data</w:t>
       </w:r>
     </w:p>
     <w:p>
@@ -32,7 +41,7 @@
           <w:rFonts w:ascii="Times New Roman" w:hAnsi="Times New Roman"/>
           <w:color w:val="000000"/>
         </w:rPr>
-        <w:t>Climate content is linked to quoted spreads across nine energy sub-industries.</w:t>
+        <w:t>Sector-specific climate content connects political information to energy finance.</w:t>
       </w:r>
     </w:p>
     <w:p>
@@ -44,7 +53,7 @@
           <w:rFonts w:ascii="Times New Roman" w:hAnsi="Times New Roman"/>
           <w:color w:val="000000"/>
         </w:rPr>
-        <w:t>Market-day and sector-month controls change the positive monthly association.</w:t>
+        <w:t>Greater exposure is associated with wider spreads under local market-day controls.</w:t>
       </w:r>
     </w:p>
     <w:p>
@@ -56,7 +65,7 @@
           <w:rFonts w:ascii="Times New Roman" w:hAnsi="Times New Roman"/>
           <w:color w:val="000000"/>
         </w:rPr>
-        <w:t>The principal estimate does not establish a positive spread association.</w:t>
+        <w:t>The association is imprecise after sector-month conditions are absorbed.</w:t>
       </w:r>
     </w:p>
     <w:p>
@@ -68,7 +77,7 @@
           <w:rFonts w:ascii="Times New Roman" w:hAnsi="Times New Roman"/>
           <w:color w:val="000000"/>
         </w:rPr>
-        <w:t>Inference accounts for sector-level content and common daily trading conditions.</w:t>
+        <w:t>A sector-sensitive index preserves differences across fossil and renewable firms.</w:t>
       </w:r>
     </w:p>
     <w:p>
@@ -80,7 +89,7 @@
           <w:rFonts w:ascii="Times New Roman" w:hAnsi="Times New Roman"/>
           <w:color w:val="000000"/>
         </w:rPr>
-        <w:t>Content availability and investor exposure remain distinct economic concepts.</w:t>
+        <w:t>Timing and alternative-outcome checks do not establish additional robust effects.</w:t>
       </w:r>
     </w:p>
     <w:sectPr>

</xml_diff>